<commit_message>
Ada Koch II, acto II: escena de la abuela en el 13 y errata; escaleta del III con las notas de la revisión
Co-Authored-By: Claude Opus 5.5 <noreply@anthropic.com>
Claude-Session: https://claude.ai/code/session_01HymiadRDUPzWBtequ8tm6m
</commit_message>
<xml_diff>
--- a/ada_koch/libro_2/El_hombre_de_al_lado_acto2_borrador.docx
+++ b/ada_koch/libro_2/El_hombre_de_al_lado_acto2_borrador.docx
@@ -1730,6 +1730,171 @@
         <w:t xml:space="preserve">No sé si para protegerlo o para protegerme.</w:t>
       </w:r>
     </w:p>
+    <w:p>
+      <w:r>
+        <w:pict>
+          <v:rect style="width:0;height:1.5pt" o:hralign="center" o:hrstd="t" o:hr="t"/>
+        </w:pict>
+      </w:r>
+    </w:p>
+    <w:p>
+      <w:pPr>
+        <w:pStyle w:val="FirstParagraph"/>
+      </w:pPr>
+      <w:r>
+        <w:t xml:space="preserve">A mediodía bajé al pueblo, a casa de mi abuela, con el folio todavía en el bolsillo de dentro del abrigo.</w:t>
+      </w:r>
+    </w:p>
+    <w:p>
+      <w:pPr>
+        <w:pStyle w:val="BodyText"/>
+      </w:pPr>
+      <w:r>
+        <w:t xml:space="preserve">No sé qué iba a preguntarle. Lo llevaba ensayando toda la carretera y no me salía ninguna frase que no sonara a locura.</w:t>
+      </w:r>
+      <w:r>
+        <w:t xml:space="preserve"> </w:t>
+      </w:r>
+      <w:r>
+        <w:rPr>
+          <w:iCs/>
+          <w:i/>
+        </w:rPr>
+        <w:t xml:space="preserve">Abuela, ¿el farero te dibujaba?</w:t>
+      </w:r>
+      <w:r>
+        <w:t xml:space="preserve"> </w:t>
+      </w:r>
+      <w:r>
+        <w:rPr>
+          <w:iCs/>
+          <w:i/>
+        </w:rPr>
+        <w:t xml:space="preserve">Abuela, ¿quién era el de arriba?</w:t>
+      </w:r>
+      <w:r>
+        <w:t xml:space="preserve"> </w:t>
+      </w:r>
+      <w:r>
+        <w:rPr>
+          <w:iCs/>
+          <w:i/>
+        </w:rPr>
+        <w:t xml:space="preserve">Abuela, ¿a ti también te afilaban los lápices?</w:t>
+      </w:r>
+    </w:p>
+    <w:p>
+      <w:pPr>
+        <w:pStyle w:val="BodyText"/>
+      </w:pPr>
+      <w:r>
+        <w:t xml:space="preserve">Me abrió la puerta con un trapo en la mano. Estaba limpiando la foto de la boda, como cada sábado aunque fuera jueves. La había bajado del aparador y la tenía en la mesa de la cocina, boca arriba, encima del mantel de hule de los limones, y le pasaba el trapo al cristal en círculos pequeños, muy despacio, como se le pasa la mano por la cara a alguien que duerme.</w:t>
+      </w:r>
+    </w:p>
+    <w:p>
+      <w:pPr>
+        <w:pStyle w:val="BodyText"/>
+      </w:pPr>
+      <w:r>
+        <w:t xml:space="preserve">En el aparador, donde iba la foto, había quedado un hueco. Y en el hueco, al fondo, contra la pared, vi una botella de aguardiente sin abrir, con el tapón lacrado y la etiqueta amarilla de vieja. Y apoyado en la botella, de canto, un sobre.</w:t>
+      </w:r>
+    </w:p>
+    <w:p>
+      <w:pPr>
+        <w:pStyle w:val="BodyText"/>
+      </w:pPr>
+      <w:r>
+        <w:t xml:space="preserve">No lo había visto nunca. Llevaba treinta y dos años entrando en esa cocina y no lo había visto nunca, porque siempre había estado detrás de mi abuelo.</w:t>
+      </w:r>
+    </w:p>
+    <w:p>
+      <w:pPr>
+        <w:pStyle w:val="BodyText"/>
+      </w:pPr>
+      <w:r>
+        <w:t xml:space="preserve">Me senté. Mi abuela me puso un café delante sin preguntarme si quería. Siguió limpiando el cristal.</w:t>
+      </w:r>
+    </w:p>
+    <w:p>
+      <w:pPr>
+        <w:pStyle w:val="BodyText"/>
+      </w:pPr>
+      <w:r>
+        <w:t xml:space="preserve">Abrí la boca para preguntar. No me salió nada.</w:t>
+      </w:r>
+    </w:p>
+    <w:p>
+      <w:pPr>
+        <w:pStyle w:val="BodyText"/>
+      </w:pPr>
+      <w:r>
+        <w:t xml:space="preserve">Y ella, sin levantar la vista de la foto, sin dejar de pasar el trapo en círculos, me miró un segundo las rodillas. Los vaqueros. El polvo gris, fino, de la chapa de la linterna, que me había quedado en las dos rodillas de estar arrodillada al amanecer delante del folio, y que no me había dado cuenta de que llevaba.</w:t>
+      </w:r>
+    </w:p>
+    <w:p>
+      <w:pPr>
+        <w:pStyle w:val="BodyText"/>
+      </w:pPr>
+      <w:r>
+        <w:t xml:space="preserve">—Subiches á torre —dijo.</w:t>
+      </w:r>
+    </w:p>
+    <w:p>
+      <w:pPr>
+        <w:pStyle w:val="BodyText"/>
+      </w:pPr>
+      <w:r>
+        <w:t xml:space="preserve">No era una pregunta.</w:t>
+      </w:r>
+    </w:p>
+    <w:p>
+      <w:pPr>
+        <w:pStyle w:val="BodyText"/>
+      </w:pPr>
+      <w:r>
+        <w:t xml:space="preserve">Volvió a poner la foto en su sitio, en el aparador, delante de la botella y del sobre. Mi abuelo, otra vez, sin mirar a la cámara, tapando lo que había detrás.</w:t>
+      </w:r>
+    </w:p>
+    <w:p>
+      <w:pPr>
+        <w:pStyle w:val="BodyText"/>
+      </w:pPr>
+      <w:r>
+        <w:t xml:space="preserve">Y no dijo nada más. Me preguntó por el trabajo, por Julian, por si el rapaz seguía con las mareas. Me dio media empanada envuelta en papel de aluminio para la cena.</w:t>
+      </w:r>
+    </w:p>
+    <w:p>
+      <w:pPr>
+        <w:pStyle w:val="BodyText"/>
+      </w:pPr>
+      <w:r>
+        <w:t xml:space="preserve">En la puerta, al despedirme, me cogió la cara con las dos manos, como hace desde que era pequeña.</w:t>
+      </w:r>
+    </w:p>
+    <w:p>
+      <w:pPr>
+        <w:pStyle w:val="BodyText"/>
+      </w:pPr>
+      <w:r>
+        <w:t xml:space="preserve">—Miña rula —dijo. Y luego, muy bajo, mirándome a los ojos—. Non lle deas as grazas a ninguén que non vexas.</w:t>
+      </w:r>
+    </w:p>
+    <w:p>
+      <w:pPr>
+        <w:pStyle w:val="BodyText"/>
+      </w:pPr>
+      <w:r>
+        <w:t xml:space="preserve">No le des las gracias a nadie que no veas.</w:t>
+      </w:r>
+    </w:p>
+    <w:p>
+      <w:pPr>
+        <w:pStyle w:val="BodyText"/>
+      </w:pPr>
+      <w:r>
+        <w:t xml:space="preserve">Volví al faro con la empanada en el asiento de al lado y la frase dando vueltas, sin saber si hablaba de Álvaro o de otra cosa.</w:t>
+      </w:r>
+    </w:p>
     <w:bookmarkStart w:id="23" w:name="maruxa-costa-da-morte-octubre-de-1983"/>
     <w:p>
       <w:pPr>
@@ -3090,7 +3255,7 @@
         <w:pStyle w:val="BodyText"/>
       </w:pPr>
       <w:r>
-        <w:t xml:space="preserve">—Era un anxo, Brais —me dijo mi madre cuando se lo conté, días después, en la cocina—. Viuña por el.</w:t>
+        <w:t xml:space="preserve">—Era un anxo, Brais —me dijo mi madre cuando se lo conté, días después, en la cocina—. Viña por el.</w:t>
       </w:r>
     </w:p>
     <w:p>

</xml_diff>

<commit_message>
Libro II: aplica crítica (orden de protección, Elisa, Álvaro sembrado, recortes) y coherencia
Co-Authored-By: Claude Opus 5.5 <noreply@anthropic.com>
Claude-Session: https://claude.ai/code/session_01HymiadRDUPzWBtequ8tm6m
</commit_message>
<xml_diff>
--- a/ada_koch/libro_2/El_hombre_de_al_lado_acto2_borrador.docx
+++ b/ada_koch/libro_2/El_hombre_de_al_lado_acto2_borrador.docx
@@ -1895,6 +1895,70 @@
         <w:t xml:space="preserve">Volví al faro con la empanada en el asiento de al lado y la frase dando vueltas, sin saber si hablaba de Álvaro o de otra cosa.</w:t>
       </w:r>
     </w:p>
+    <w:p>
+      <w:pPr>
+        <w:pStyle w:val="BodyText"/>
+      </w:pPr>
+      <w:r>
+        <w:t xml:space="preserve">En la curva de la gasolinera, a la salida del pueblo, había un coche parado en el arcén con el motor en marcha.</w:t>
+      </w:r>
+    </w:p>
+    <w:p>
+      <w:pPr>
+        <w:pStyle w:val="BodyText"/>
+      </w:pPr>
+      <w:r>
+        <w:t xml:space="preserve">Un BMW gris oscuro. Con los cristales de atrás tintados y el tubo de escape echando un humo blanco, quieto, en el aire frío.</w:t>
+      </w:r>
+    </w:p>
+    <w:p>
+      <w:pPr>
+        <w:pStyle w:val="BodyText"/>
+      </w:pPr>
+      <w:r>
+        <w:t xml:space="preserve">No lo miré al pasar. Lo miré por el retrovisor.</w:t>
+      </w:r>
+    </w:p>
+    <w:p>
+      <w:pPr>
+        <w:pStyle w:val="BodyText"/>
+      </w:pPr>
+      <w:r>
+        <w:t xml:space="preserve">En el parachoques de atrás, a la izquierda, tenía una abolladura. Pequeña, con la pintura saltada en forma de uña. La que le hice yo, una noche de lluvia, al dar marcha atrás contra una columna del garaje de la calle Ibiza. La que me costó dos semanas sin poder coger el coche y una conversación en la cocina que no quiero recordar.</w:t>
+      </w:r>
+    </w:p>
+    <w:p>
+      <w:pPr>
+        <w:pStyle w:val="BodyText"/>
+      </w:pPr>
+      <w:r>
+        <w:t xml:space="preserve">No podía ser. Hay miles de coches grises. Hay miles de abolladuras.</w:t>
+      </w:r>
+    </w:p>
+    <w:p>
+      <w:pPr>
+        <w:pStyle w:val="BodyText"/>
+      </w:pPr>
+      <w:r>
+        <w:t xml:space="preserve">Pisé el freno sin querer. El coche de atrás se puso en marcha. Despacio. Sin intermitente. Me adelantó en la recta de los eucaliptos, sin prisa, y por la ventanilla del conductor, que era la única sin tintar, vi un codo con la manga de un abrigo azul marino. Nada más. Un codo.</w:t>
+      </w:r>
+    </w:p>
+    <w:p>
+      <w:pPr>
+        <w:pStyle w:val="BodyText"/>
+      </w:pPr>
+      <w:r>
+        <w:t xml:space="preserve">Se perdió hacia Cee.</w:t>
+      </w:r>
+    </w:p>
+    <w:p>
+      <w:pPr>
+        <w:pStyle w:val="BodyText"/>
+      </w:pPr>
+      <w:r>
+        <w:t xml:space="preserve">Aparqué en la explanada del faro y me quedé dentro del coche con las manos en el volante hasta que la empanada se enfrió. No se lo conté a Julian. No se lo conté a nadie. Me dije que no había visto la matrícula. Era verdad. No la había querido ver.</w:t>
+      </w:r>
+    </w:p>
     <w:bookmarkStart w:id="23" w:name="maruxa-costa-da-morte-octubre-de-1983"/>
     <w:p>
       <w:pPr>
@@ -5558,7 +5622,7 @@
         <w:pStyle w:val="BodyText"/>
       </w:pPr>
       <w:r>
-        <w:t xml:space="preserve">—Eu sei o que é iso, Ada —dijo mi madre. Y le temblaba la voz—. Eu tamén vin cousas. Cando tiña a túa idade. Cando se foi teu pai. Eu tamén vin cousas que non estaban.</w:t>
+        <w:t xml:space="preserve">—Eu sei o que é iso, Ada —dijo mi madre. Y le temblaba la voz—. Eu tamén vin cousas. Cando era rapaza. E outra vez cando se foi teu pai. Eu tamén vin cousas que non estaban.</w:t>
       </w:r>
     </w:p>
     <w:p>
@@ -5591,6 +5655,70 @@
       </w:pPr>
       <w:r>
         <w:t xml:space="preserve">Estás enferma. Como yo. No es culpa tuya. Ven a casa. Yo te cuido.</w:t>
+      </w:r>
+    </w:p>
+    <w:p>
+      <w:pPr>
+        <w:pStyle w:val="BodyText"/>
+      </w:pPr>
+      <w:r>
+        <w:t xml:space="preserve">Y luego, sin venir a cuento, con otra voz, una voz pequeña, de niña que pregunta la hora:</w:t>
+      </w:r>
+    </w:p>
+    <w:p>
+      <w:pPr>
+        <w:pStyle w:val="BodyText"/>
+      </w:pPr>
+      <w:r>
+        <w:t xml:space="preserve">—Ada. ¿Segue apagada a lanterna?</w:t>
+      </w:r>
+    </w:p>
+    <w:p>
+      <w:pPr>
+        <w:pStyle w:val="BodyText"/>
+      </w:pPr>
+      <w:r>
+        <w:t xml:space="preserve">—¿Qué?</w:t>
+      </w:r>
+    </w:p>
+    <w:p>
+      <w:pPr>
+        <w:pStyle w:val="BodyText"/>
+      </w:pPr>
+      <w:r>
+        <w:t xml:space="preserve">—A do faro vello. A de arriba. ¿Segue apagada?</w:t>
+      </w:r>
+    </w:p>
+    <w:p>
+      <w:pPr>
+        <w:pStyle w:val="BodyText"/>
+      </w:pPr>
+      <w:r>
+        <w:t xml:space="preserve">—Claro que sí, mamá. Desde el ochenta y siete.</w:t>
+      </w:r>
+    </w:p>
+    <w:p>
+      <w:pPr>
+        <w:pStyle w:val="BodyText"/>
+      </w:pPr>
+      <w:r>
+        <w:t xml:space="preserve">Un silencio largo. Su respiración. El ruido de una persiana, allá en Santiago, que alguien bajaba un poco más.</w:t>
+      </w:r>
+    </w:p>
+    <w:p>
+      <w:pPr>
+        <w:pStyle w:val="BodyText"/>
+      </w:pPr>
+      <w:r>
+        <w:t xml:space="preserve">—Ah —dijo—. Ben.</w:t>
+      </w:r>
+    </w:p>
+    <w:p>
+      <w:pPr>
+        <w:pStyle w:val="BodyText"/>
+      </w:pPr>
+      <w:r>
+        <w:t xml:space="preserve">Y volvió a lo del médico, a lo de Santiago, a lo de que estaba enferma, como si no hubiera preguntado nada.</w:t>
       </w:r>
     </w:p>
     <w:p>
@@ -6421,7 +6549,7 @@
         <w:pStyle w:val="BodyText"/>
       </w:pPr>
       <w:r>
-        <w:t xml:space="preserve">Lo supe antes de abrir los ojos dentro del sueño, por la luz. Una luz blanca, enorme, que pasaba por encima de mis párpados cerrados cada pocos segundos, de izquierda a derecha, y se iba, y volvía. Como pasa la luz de un faro por una habitación de la costa en las películas. Como no ha pasado nunca por mi habitación, porque mi faro lleva apagado desde antes de que yo naciera.</w:t>
+        <w:t xml:space="preserve">Lo supe antes de abrir los ojos dentro del sueño, por la luz. Una luz blanca, enorme, que pasaba por encima de mis párpados cerrados cada pocos segundos, de izquierda a derecha, y se iba, y volvía. Como no ha pasado nunca por mi habitación, porque mi faro lleva apagado desde antes de que yo naciera.</w:t>
       </w:r>
     </w:p>
     <w:p>
@@ -6523,7 +6651,7 @@
         <w:pStyle w:val="FirstParagraph"/>
       </w:pPr>
       <w:r>
-        <w:t xml:space="preserve">No voy a contar todo. No porque no me acuerde. Me acuerdo de todo. De cada segundo. Me acuerdo con el cuerpo, que es la memoria que no se puede borrar.</w:t>
+        <w:t xml:space="preserve">No voy a contar todo. Me acuerdo con el cuerpo, que es la memoria que no se puede borrar.</w:t>
       </w:r>
     </w:p>
     <w:p>
@@ -6832,7 +6960,7 @@
         <w:pStyle w:val="BodyText"/>
       </w:pPr>
       <w:r>
-        <w:t xml:space="preserve">No fue como en el sofá. En el sofá lo miré hasta el final. Me agarré a su cara como a una barandilla. Me obligué a tener los ojos abiertos, a ver su cara, a decir su nombre en voz alta dos veces para no olvidarme de quién era.</w:t>
+        <w:t xml:space="preserve">No fue como en el sofá. En el sofá lo miré hasta el final y dije su nombre en voz alta dos veces para no olvidarme de quién era.</w:t>
       </w:r>
     </w:p>
     <w:p>
@@ -6937,7 +7065,7 @@
         <w:pStyle w:val="BodyText"/>
       </w:pPr>
       <w:r>
-        <w:t xml:space="preserve">Tenía dieciocho años. Llevaba mi vestido, arreglado por una modista de Cee, con la cintura metida y las mangas cortadas. Estaba guapísima. Estaba seria. Sonrió dos veces en toda la ceremonia, y las dos veces mirándolo a él.</w:t>
+        <w:t xml:space="preserve">Tenía diecisiete años. Llevaba mi vestido, arreglado por una modista de Cee, con la cintura metida y las mangas cortadas. Estaba guapísima. Estaba seria. Sonrió dos veces en toda la ceremonia, y las dos veces mirándolo a él.</w:t>
       </w:r>
     </w:p>
     <w:p>

</xml_diff>